<commit_message>
feat: prepare 4.4 release docs, deck, and Linux CI gates
Unblock PR #243: compile with -fPIC, add `make nanoc` for the bench job,
accept i18n drafts that point at English generated guides, and drop the
utf8proc apt packages that 241 already removed on main. Document 4.1–4.4
as one v4.4.0 tag, rebuild the developer deck, and draft the LinkedIn post.

Related to task_7b6e8957be5b4abf8b0ea4751fd9b635.

Co-authored-by: factory-droid[bot] <138933559+factory-droid[bot]@users.noreply.github.com>
</commit_message>
<xml_diff>
--- a/docs/presentation/nanolang-developer-overview.docx
+++ b/docs/presentation/nanolang-developer-overview.docx
@@ -12,15 +12,10 @@
     </w:p>
     <w:p>
       <w:pPr>
-        <w:spacing w:after="160" w:line="240" w:lineRule="auto"/>
+        <w:pStyle w:val="Heading2"/>
       </w:pPr>
       <w:r>
-        <w:rPr>
-          <w:rFonts w:ascii="Calibri" w:hAnsi="Calibri"/>
-          <w:color w:val="101317"/>
-          <w:sz w:val="22"/>
-        </w:rPr>
-        <w:t>I am NanoLang. This is my developer narrative for release 3.5. It explains my language contract, compiler paths, NanoISA bytecode, NanoVM execution, foreign-function boundary, tests, diagnostics, and the work I have reserved for 4.0.</w:t>
+        <w:t>What I am</w:t>
       </w:r>
     </w:p>
     <w:p>
@@ -33,7 +28,41 @@
           <w:color w:val="101317"/>
           <w:sz w:val="22"/>
         </w:rPr>
-        <w:t>Authority: docs/PERSONA.md, README.md, docs/NANOISA.md, docs/ROADMAP.md, spec/nanoisa.yaml, and the current test suites.</w:t>
+        <w:t>I am NanoLang. This is my developer narrative for release 4.4. It explains my language contract, compiler paths, NanoISA bytecode, NanoVM execution, foreign-function boundary, Nano Service Interface, tests, diagnostics, and the work I have not done.</w:t>
+      </w:r>
+    </w:p>
+    <w:p>
+      <w:pPr>
+        <w:spacing w:after="160" w:line="240" w:lineRule="auto"/>
+      </w:pPr>
+      <w:r>
+        <w:rPr>
+          <w:rFonts w:ascii="Calibri" w:hAnsi="Calibri"/>
+          <w:color w:val="101317"/>
+          <w:sz w:val="22"/>
+        </w:rPr>
+        <w:t>Authority: docs/PERSONA.md, README.md, docs/NANOISA.md, docs/NSI.md, docs/NSI_FABRIC.md, docs/NANO_EMACS.md, docs/ROADMAP.md, spec/nanoisa.yaml, docs/RELEASE_4.4.md, and the current test suites.</w:t>
+      </w:r>
+    </w:p>
+    <w:p>
+      <w:pPr>
+        <w:pStyle w:val="Heading2"/>
+      </w:pPr>
+      <w:r>
+        <w:t>Who this is for</w:t>
+      </w:r>
+    </w:p>
+    <w:p>
+      <w:pPr>
+        <w:spacing w:after="160" w:line="240" w:lineRule="auto"/>
+      </w:pPr>
+      <w:r>
+        <w:rPr>
+          <w:rFonts w:ascii="Calibri" w:hAnsi="Calibri"/>
+          <w:color w:val="101317"/>
+          <w:sz w:val="22"/>
+        </w:rPr>
+        <w:t>Software developers and compiler engineers who need the technical account behind the companion deck. I describe tested behavior. Roadmap work is labelled as such.</w:t>
       </w:r>
     </w:p>
     <w:p>
@@ -128,7 +157,7 @@
           <w:color w:val="101317"/>
           <w:sz w:val="22"/>
         </w:rPr>
-        <w:t>My NanoCore semantics have mechanized proofs for preservation, progress, determinism, semantic equivalence, and evaluator soundness. Full NanoLang, NanoISA, FFI, and generated-C behavior remains outside that proved subset unless explicitly stated otherwise.</w:t>
+        <w:t>My NanoCore semantics have mechanized proofs for preservation, progress, determinism, semantic equivalence, and evaluator soundness. Full NanoLang, NanoISA, FFI, NSI, and generated-C behavior remains outside that proved subset unless explicitly stated otherwise.</w:t>
       </w:r>
     </w:p>
     <w:p>
@@ -212,7 +241,7 @@
           <w:color w:val="101317"/>
           <w:sz w:val="22"/>
         </w:rPr>
-        <w:t>NanoVM decodes each function once, records instruction boundaries, and executes the decoded representation. A private indexed cursor reduces repeated byte-offset lookup while preserving byte offsets for diagnostics and traps.</w:t>
+        <w:t>NanoVM decodes each function once, records instruction boundaries, and executes the decoded representation. A private indexed cursor reduces repeated byte-offset lookup while preserving byte offsets for diagnostics and traps. Bytecode is verified before it runs.</w:t>
       </w:r>
     </w:p>
     <w:p>
@@ -262,7 +291,7 @@
           <w:color w:val="101317"/>
           <w:sz w:val="22"/>
         </w:rPr>
-        <w:t>NanoVM values are tagged. Strings, arrays, structs, tuples, unions, hash maps, and closures are heap objects managed through retain and release operations. The remaining 4.0 roadmap includes additional ownership and representation work; I do not describe that work as finished.</w:t>
+        <w:t>NanoVM values are tagged. Strings, arrays, structs, tuples, unions, hash maps, and closures are heap objects managed through retain and release operations. NanoVM collects reference cycles. Generated C already did.</w:t>
       </w:r>
     </w:p>
     <w:p>
@@ -304,7 +333,7 @@
           <w:color w:val="101317"/>
           <w:sz w:val="22"/>
         </w:rPr>
-        <w:t>The current NVM loader rejects duplicate or overlapping sections, directory intrusion, partial fixed-width records, trailing data, and arithmetic-overflow ranges. The broader v2 module contract remains 4.0 work.</w:t>
+        <w:t>The v2 NVM loader rejects duplicate or overlapping sections, directory intrusion, partial fixed-width records, trailing data, and arithmetic-overflow ranges. Feature bits fail closed.</w:t>
       </w:r>
     </w:p>
     <w:p>
@@ -333,7 +362,7 @@
           <w:color w:val="101317"/>
           <w:sz w:val="22"/>
         </w:rPr>
-        <w:t>The current focused suites report 1,090 NanoISA tests, 322 NanoVM tests, and 63 NanoVirt tests passing. CI additionally exercises x64, arm64, C, PTX, RISC-V, sanitizers, coverage, documentation, benchmarks, and security checks.</w:t>
+        <w:t>4.0 counted 2,632 NanoISA tests, 621 NanoVM tests, 63 NanoVirt tests, and 93 verifier tests at the v4.0.0 tag. 4.4 adds NSI, fabric, catalog, Forth, and nano_emacs_worker suites on top of that. CI exercises x64, arm64, sanitizers, coverage, documentation, benchmarks, and security checks.</w:t>
       </w:r>
     </w:p>
     <w:p>
@@ -383,7 +412,7 @@
         <w:pStyle w:val="Heading1"/>
       </w:pPr>
       <w:r>
-        <w:t>Release 3.5</w:t>
+        <w:t>Release 4.0</w:t>
       </w:r>
     </w:p>
     <w:p>
@@ -404,7 +433,28 @@
           <w:color w:val="101317"/>
           <w:sz w:val="22"/>
         </w:rPr>
-        <w:t>I shipped measured NanoISA execution, generated ISA metadata, typed scalar and aggregate operations, side-table debug data, predecoded execution, direct tail calls, opcode diagnostics, and runtime-selectable generated-C profiling.</w:t>
+        <w:t>I shipped NanoISA v2 and NanoVM v2: a regular portable instruction set, a v2 module format, stack and type verification, return-shape and ownership checks, fuzzed parsing surfaces, cycle collection, and measured dispatch. See docs/RELEASE_4.0.md.</w:t>
+      </w:r>
+    </w:p>
+    <w:p>
+      <w:pPr>
+        <w:pStyle w:val="Heading2"/>
+      </w:pPr>
+      <w:r>
+        <w:t>What the verifier used to miss</w:t>
+      </w:r>
+    </w:p>
+    <w:p>
+      <w:pPr>
+        <w:spacing w:after="160" w:line="240" w:lineRule="auto"/>
+      </w:pPr>
+      <w:r>
+        <w:rPr>
+          <w:rFonts w:ascii="Calibri" w:hAnsi="Calibri"/>
+          <w:color w:val="101317"/>
+          <w:sz w:val="22"/>
+        </w:rPr>
+        <w:t>The previous verifier declared stack effects for 32 of 161 instructions and skipped the rest, including successors, then returned ok. An unknown effect is now a hard failure. Absence of evidence must not read as proof.</w:t>
       </w:r>
     </w:p>
     <w:p>
@@ -425,7 +475,15 @@
           <w:color w:val="101317"/>
           <w:sz w:val="22"/>
         </w:rPr>
-        <w:t>The benchmark harness runs seven maintained workloads with 20 samples per workload. All seven workloads completed with exit code zero. The summary records distributions and normalized cost rather than a single timing claim.</w:t>
+        <w:t>The benchmark harness times each workload once and with many iterations behind one process startup so the per-iteration cost is the difference. docs/NANOISA_MEASUREMENTS.md is the authority for every performance number, including optimizations I declined.</w:t>
+      </w:r>
+    </w:p>
+    <w:p>
+      <w:pPr>
+        <w:pStyle w:val="Heading1"/>
+      </w:pPr>
+      <w:r>
+        <w:t>Release 4.4</w:t>
       </w:r>
     </w:p>
     <w:p>
@@ -433,7 +491,7 @@
         <w:pStyle w:val="Heading2"/>
       </w:pPr>
       <w:r>
-        <w:t>What I do not claim</w:t>
+        <w:t>Forth Core evidence</w:t>
       </w:r>
     </w:p>
     <w:p>
@@ -446,15 +504,7 @@
           <w:color w:val="101317"/>
           <w:sz w:val="22"/>
         </w:rPr>
-        <w:t>I do not claim that my full NanoISA v2 verifier, linked callable handles, v2 module header, typed mixed ABI, runtime representation redesign, computed-goto dispatch, or superinstruction program is complete. Those are 4.0 roadmap work.</w:t>
-      </w:r>
-    </w:p>
-    <w:p>
-      <w:pPr>
-        <w:pStyle w:val="Heading1"/>
-      </w:pPr>
-      <w:r>
-        <w:t>The 4.0 boundary</w:t>
+        <w:t>A NanoISA Forth session compiles colon definitions to verified bytecode. Jackson Core and Core Ext suites are vendored; make test-forth-coreext and make test-forth-jackson record what they pass. INCLUDED remains a recorded gap. I do not claim a Standard System. Authority: docs/FORTH_2012.md.</w:t>
       </w:r>
     </w:p>
     <w:p>
@@ -462,7 +512,7 @@
         <w:pStyle w:val="Heading2"/>
       </w:pPr>
       <w:r>
-        <w:t>Verifier and module work</w:t>
+        <w:t>Catalogs and guide drafts</w:t>
       </w:r>
     </w:p>
     <w:p>
@@ -475,7 +525,7 @@
           <w:color w:val="101317"/>
           <w:sz w:val="22"/>
         </w:rPr>
-        <w:t>I still need stack-height and type-flow verification across control-flow joins, complete signature and ownership checks, richer module sections, symbolic assembly operands, lossless disassembly, and exhaustive opcode coverage.</w:t>
+        <w:t>UTF-8 message catalogs exist for en, zh, hi, es, ar, and fr. Human stderr can follow the process locale. JSON and TOON stay English. User-guide drafts under userguide/i18n/ are machine-generated. I do not call the system internationalized.</w:t>
       </w:r>
     </w:p>
     <w:p>
@@ -483,7 +533,7 @@
         <w:pStyle w:val="Heading2"/>
       </w:pPr>
       <w:r>
-        <w:t>Runtime representation and dispatch</w:t>
+        <w:t>NSI, capabilities, and POSIX fabric</w:t>
       </w:r>
     </w:p>
     <w:p>
@@ -496,7 +546,7 @@
           <w:color w:val="101317"/>
           <w:sz w:val="22"/>
         </w:rPr>
-        <w:t>I still need measured decisions for globals, constants, strings, homogeneous arrays, hash maps, ownership, and private optimized dispatch. A faster path earns its place only through repeatable NanoLang and Forth measurements.</w:t>
+        <w:t>NSI v0 is a fail-closed document of ids, payloads, and compatibility. Generators emit NanoLang, Forth, Python, Rust, and C++ stubs. Unforgeable NlCap tokens, capability-scoped shared memory, and a POSIX supervisor host services on an ordinary kernel. I do not claim a kernel, or a CUDA or CPython wrap. Authority: docs/NSI.md, docs/NSI_FABRIC.md, docs/NSI_TCB.md.</w:t>
       </w:r>
     </w:p>
     <w:p>
@@ -504,7 +554,7 @@
         <w:pStyle w:val="Heading2"/>
       </w:pPr>
       <w:r>
-        <w:t>FFI and transport</w:t>
+        <w:t>Isolated Nano Emacs walker</w:t>
       </w:r>
     </w:p>
     <w:p>
@@ -517,7 +567,28 @@
           <w:color w:val="101317"/>
           <w:sz w:val="22"/>
         </w:rPr>
-        <w:t>I still need typed call descriptors, a sound mixed-type ABI, consistent argument limits, large-payload transport, and lifecycle evidence for crashes, restarts, and batching.</w:t>
+        <w:t>The SDL frame does not dlopen the interpreter. Eval goes to bin/nano_emacs_worker over a length-prefixed pipe. Crash-restart keeps buffers. freeze-defun runs nano_vm as a grandchild. I do not claim GNU Emacs. Authority: docs/NANO_EMACS.md.</w:t>
+      </w:r>
+    </w:p>
+    <w:p>
+      <w:pPr>
+        <w:pStyle w:val="Heading1"/>
+      </w:pPr>
+      <w:r>
+        <w:t>What I have not done</w:t>
+      </w:r>
+    </w:p>
+    <w:p>
+      <w:pPr>
+        <w:spacing w:after="160" w:line="240" w:lineRule="auto"/>
+      </w:pPr>
+      <w:r>
+        <w:rPr>
+          <w:rFonts w:ascii="Calibri" w:hAnsi="Calibri"/>
+          <w:color w:val="101317"/>
+          <w:sz w:val="22"/>
+        </w:rPr>
+        <w:t>I have not claimed a Forth Standard System, reviewed human translations, GNU Emacs compatibility, a kernel, CUDA or CPython as wrapped runtimes, Makefile header dependencies (GitHub issue #211), or the 5.0 one-IR rewrite. 4.5 effects and replay are next. See docs/RELEASE_4.4.md and docs/ROADMAP.md.</w:t>
       </w:r>
     </w:p>
     <w:p>
@@ -546,7 +617,7 @@
           <w:color w:val="101317"/>
           <w:sz w:val="22"/>
         </w:rPr>
-        <w:t>Start with docs/PERSONA.md, docs/ROADMAP.md, the relevant source symbols, and the matching tests. Keep 4.0 work in its declared queue. Do not turn a roadmap sentence into a feature claim.</w:t>
+        <w:t>Start with docs/PERSONA.md, docs/ROADMAP.md, docs/RELEASE_4.4.md, the relevant source symbols, and the matching tests. Do not turn a roadmap sentence into a feature claim.</w:t>
       </w:r>
     </w:p>
     <w:p>
@@ -567,15 +638,13 @@
           <w:color w:val="65707C"/>
           <w:sz w:val="18"/>
         </w:rPr>
-        <w:t>make -f Makefile.gnu test-nanoisa</w:t>
+        <w:t>make test</w:t>
         <w:br/>
-        <w:t>make -f Makefile.gnu test-nanovm</w:t>
+        <w:t>make test-nsi test-nsi-cap test-nsi-fabric</w:t>
         <w:br/>
-        <w:t>make -f Makefile.gnu test-nanovirt</w:t>
+        <w:t>make test-nano-emacs-worker</w:t>
         <w:br/>
-        <w:t>make -f Makefile.gnu test-dynamic-profile</w:t>
-        <w:br/>
-        <w:t>NANOISA_BENCH_RUNS=20 bash scripts/benchmark_nanoisa.sh</w:t>
+        <w:t>make release-docs-check</w:t>
       </w:r>
     </w:p>
     <w:p>

</xml_diff>

<commit_message>
feat: 4.1–4.4 Forth evidence, catalogs, NSI, and POSIX fabric
Product 4.1–4.4 on feat/forth-core-suite. Last tagged GitHub release is v4.0.0.
Tag one v4.4.0 after this lands. I do not claim a Forth 2012 Standard System,
GNU Emacs, a kernel, a CUDA/CPython wrap, or completed i18n.

- 4.1: Jackson Core suite vendor pin and INCLUDE gap
- 4.2: catalogs and machine-draft guide editions
- 4.3: NSI v0 typed payloads
- 4.4: capabilities/POSIX fabric and isolated nano_emacs_worker
- CI: PIC/nanoc, GCC 15 truncation, gcov skip of Jackson word-set REFILL/PTY/IDE
</commit_message>
<xml_diff>
--- a/docs/presentation/nanolang-developer-overview.docx
+++ b/docs/presentation/nanolang-developer-overview.docx
@@ -12,15 +12,10 @@
     </w:p>
     <w:p>
       <w:pPr>
-        <w:spacing w:after="160" w:line="240" w:lineRule="auto"/>
+        <w:pStyle w:val="Heading2"/>
       </w:pPr>
       <w:r>
-        <w:rPr>
-          <w:rFonts w:ascii="Calibri" w:hAnsi="Calibri"/>
-          <w:color w:val="101317"/>
-          <w:sz w:val="22"/>
-        </w:rPr>
-        <w:t>I am NanoLang. This is my developer narrative for release 3.5. It explains my language contract, compiler paths, NanoISA bytecode, NanoVM execution, foreign-function boundary, tests, diagnostics, and the work I have reserved for 4.0.</w:t>
+        <w:t>What I am</w:t>
       </w:r>
     </w:p>
     <w:p>
@@ -33,7 +28,41 @@
           <w:color w:val="101317"/>
           <w:sz w:val="22"/>
         </w:rPr>
-        <w:t>Authority: docs/PERSONA.md, README.md, docs/NANOISA.md, docs/ROADMAP.md, spec/nanoisa.yaml, and the current test suites.</w:t>
+        <w:t>I am NanoLang. This is my developer narrative for release 4.4. It explains my language contract, compiler paths, NanoISA bytecode, NanoVM execution, foreign-function boundary, Nano Service Interface, tests, diagnostics, and the work I have not done.</w:t>
+      </w:r>
+    </w:p>
+    <w:p>
+      <w:pPr>
+        <w:spacing w:after="160" w:line="240" w:lineRule="auto"/>
+      </w:pPr>
+      <w:r>
+        <w:rPr>
+          <w:rFonts w:ascii="Calibri" w:hAnsi="Calibri"/>
+          <w:color w:val="101317"/>
+          <w:sz w:val="22"/>
+        </w:rPr>
+        <w:t>Authority: docs/PERSONA.md, README.md, docs/NANOISA.md, docs/NSI.md, docs/NSI_FABRIC.md, docs/NANO_EMACS.md, docs/ROADMAP.md, spec/nanoisa.yaml, docs/RELEASE_4.4.md, and the current test suites.</w:t>
+      </w:r>
+    </w:p>
+    <w:p>
+      <w:pPr>
+        <w:pStyle w:val="Heading2"/>
+      </w:pPr>
+      <w:r>
+        <w:t>Who this is for</w:t>
+      </w:r>
+    </w:p>
+    <w:p>
+      <w:pPr>
+        <w:spacing w:after="160" w:line="240" w:lineRule="auto"/>
+      </w:pPr>
+      <w:r>
+        <w:rPr>
+          <w:rFonts w:ascii="Calibri" w:hAnsi="Calibri"/>
+          <w:color w:val="101317"/>
+          <w:sz w:val="22"/>
+        </w:rPr>
+        <w:t>Software developers and compiler engineers who need the technical account behind the companion deck. I describe tested behavior. Roadmap work is labelled as such.</w:t>
       </w:r>
     </w:p>
     <w:p>
@@ -128,7 +157,7 @@
           <w:color w:val="101317"/>
           <w:sz w:val="22"/>
         </w:rPr>
-        <w:t>My NanoCore semantics have mechanized proofs for preservation, progress, determinism, semantic equivalence, and evaluator soundness. Full NanoLang, NanoISA, FFI, and generated-C behavior remains outside that proved subset unless explicitly stated otherwise.</w:t>
+        <w:t>My NanoCore semantics have mechanized proofs for preservation, progress, determinism, semantic equivalence, and evaluator soundness. Full NanoLang, NanoISA, FFI, NSI, and generated-C behavior remains outside that proved subset unless explicitly stated otherwise.</w:t>
       </w:r>
     </w:p>
     <w:p>
@@ -212,7 +241,7 @@
           <w:color w:val="101317"/>
           <w:sz w:val="22"/>
         </w:rPr>
-        <w:t>NanoVM decodes each function once, records instruction boundaries, and executes the decoded representation. A private indexed cursor reduces repeated byte-offset lookup while preserving byte offsets for diagnostics and traps.</w:t>
+        <w:t>NanoVM decodes each function once, records instruction boundaries, and executes the decoded representation. A private indexed cursor reduces repeated byte-offset lookup while preserving byte offsets for diagnostics and traps. Bytecode is verified before it runs.</w:t>
       </w:r>
     </w:p>
     <w:p>
@@ -262,7 +291,7 @@
           <w:color w:val="101317"/>
           <w:sz w:val="22"/>
         </w:rPr>
-        <w:t>NanoVM values are tagged. Strings, arrays, structs, tuples, unions, hash maps, and closures are heap objects managed through retain and release operations. The remaining 4.0 roadmap includes additional ownership and representation work; I do not describe that work as finished.</w:t>
+        <w:t>NanoVM values are tagged. Strings, arrays, structs, tuples, unions, hash maps, and closures are heap objects managed through retain and release operations. NanoVM collects reference cycles. Generated C already did.</w:t>
       </w:r>
     </w:p>
     <w:p>
@@ -304,7 +333,7 @@
           <w:color w:val="101317"/>
           <w:sz w:val="22"/>
         </w:rPr>
-        <w:t>The current NVM loader rejects duplicate or overlapping sections, directory intrusion, partial fixed-width records, trailing data, and arithmetic-overflow ranges. The broader v2 module contract remains 4.0 work.</w:t>
+        <w:t>The v2 NVM loader rejects duplicate or overlapping sections, directory intrusion, partial fixed-width records, trailing data, and arithmetic-overflow ranges. Feature bits fail closed.</w:t>
       </w:r>
     </w:p>
     <w:p>
@@ -333,7 +362,7 @@
           <w:color w:val="101317"/>
           <w:sz w:val="22"/>
         </w:rPr>
-        <w:t>The current focused suites report 1,090 NanoISA tests, 322 NanoVM tests, and 63 NanoVirt tests passing. CI additionally exercises x64, arm64, C, PTX, RISC-V, sanitizers, coverage, documentation, benchmarks, and security checks.</w:t>
+        <w:t>4.0 counted 2,632 NanoISA tests, 621 NanoVM tests, 63 NanoVirt tests, and 93 verifier tests at the v4.0.0 tag. 4.4 adds NSI, fabric, catalog, Forth, and nano_emacs_worker suites on top of that. CI exercises x64, arm64, sanitizers, coverage, documentation, benchmarks, and security checks.</w:t>
       </w:r>
     </w:p>
     <w:p>
@@ -383,7 +412,7 @@
         <w:pStyle w:val="Heading1"/>
       </w:pPr>
       <w:r>
-        <w:t>Release 3.5</w:t>
+        <w:t>Release 4.0</w:t>
       </w:r>
     </w:p>
     <w:p>
@@ -404,7 +433,28 @@
           <w:color w:val="101317"/>
           <w:sz w:val="22"/>
         </w:rPr>
-        <w:t>I shipped measured NanoISA execution, generated ISA metadata, typed scalar and aggregate operations, side-table debug data, predecoded execution, direct tail calls, opcode diagnostics, and runtime-selectable generated-C profiling.</w:t>
+        <w:t>I shipped NanoISA v2 and NanoVM v2: a regular portable instruction set, a v2 module format, stack and type verification, return-shape and ownership checks, fuzzed parsing surfaces, cycle collection, and measured dispatch. See docs/RELEASE_4.0.md.</w:t>
+      </w:r>
+    </w:p>
+    <w:p>
+      <w:pPr>
+        <w:pStyle w:val="Heading2"/>
+      </w:pPr>
+      <w:r>
+        <w:t>What the verifier used to miss</w:t>
+      </w:r>
+    </w:p>
+    <w:p>
+      <w:pPr>
+        <w:spacing w:after="160" w:line="240" w:lineRule="auto"/>
+      </w:pPr>
+      <w:r>
+        <w:rPr>
+          <w:rFonts w:ascii="Calibri" w:hAnsi="Calibri"/>
+          <w:color w:val="101317"/>
+          <w:sz w:val="22"/>
+        </w:rPr>
+        <w:t>The previous verifier declared stack effects for 32 of 161 instructions and skipped the rest, including successors, then returned ok. An unknown effect is now a hard failure. Absence of evidence must not read as proof.</w:t>
       </w:r>
     </w:p>
     <w:p>
@@ -425,7 +475,15 @@
           <w:color w:val="101317"/>
           <w:sz w:val="22"/>
         </w:rPr>
-        <w:t>The benchmark harness runs seven maintained workloads with 20 samples per workload. All seven workloads completed with exit code zero. The summary records distributions and normalized cost rather than a single timing claim.</w:t>
+        <w:t>The benchmark harness times each workload once and with many iterations behind one process startup so the per-iteration cost is the difference. docs/NANOISA_MEASUREMENTS.md is the authority for every performance number, including optimizations I declined.</w:t>
+      </w:r>
+    </w:p>
+    <w:p>
+      <w:pPr>
+        <w:pStyle w:val="Heading1"/>
+      </w:pPr>
+      <w:r>
+        <w:t>Release 4.4</w:t>
       </w:r>
     </w:p>
     <w:p>
@@ -433,7 +491,7 @@
         <w:pStyle w:val="Heading2"/>
       </w:pPr>
       <w:r>
-        <w:t>What I do not claim</w:t>
+        <w:t>Forth Core evidence</w:t>
       </w:r>
     </w:p>
     <w:p>
@@ -446,15 +504,7 @@
           <w:color w:val="101317"/>
           <w:sz w:val="22"/>
         </w:rPr>
-        <w:t>I do not claim that my full NanoISA v2 verifier, linked callable handles, v2 module header, typed mixed ABI, runtime representation redesign, computed-goto dispatch, or superinstruction program is complete. Those are 4.0 roadmap work.</w:t>
-      </w:r>
-    </w:p>
-    <w:p>
-      <w:pPr>
-        <w:pStyle w:val="Heading1"/>
-      </w:pPr>
-      <w:r>
-        <w:t>The 4.0 boundary</w:t>
+        <w:t>A NanoISA Forth session compiles colon definitions to verified bytecode. Jackson Core and Core Ext suites are vendored; make test-forth-coreext and make test-forth-jackson record what they pass. INCLUDED remains a recorded gap. I do not claim a Standard System. Authority: docs/FORTH_2012.md.</w:t>
       </w:r>
     </w:p>
     <w:p>
@@ -462,7 +512,7 @@
         <w:pStyle w:val="Heading2"/>
       </w:pPr>
       <w:r>
-        <w:t>Verifier and module work</w:t>
+        <w:t>Catalogs and guide drafts</w:t>
       </w:r>
     </w:p>
     <w:p>
@@ -475,7 +525,7 @@
           <w:color w:val="101317"/>
           <w:sz w:val="22"/>
         </w:rPr>
-        <w:t>I still need stack-height and type-flow verification across control-flow joins, complete signature and ownership checks, richer module sections, symbolic assembly operands, lossless disassembly, and exhaustive opcode coverage.</w:t>
+        <w:t>UTF-8 message catalogs exist for en, zh, hi, es, ar, and fr. Human stderr can follow the process locale. JSON and TOON stay English. User-guide drafts under userguide/i18n/ are machine-generated. I do not call the system internationalized.</w:t>
       </w:r>
     </w:p>
     <w:p>
@@ -483,7 +533,7 @@
         <w:pStyle w:val="Heading2"/>
       </w:pPr>
       <w:r>
-        <w:t>Runtime representation and dispatch</w:t>
+        <w:t>NSI, capabilities, and POSIX fabric</w:t>
       </w:r>
     </w:p>
     <w:p>
@@ -496,7 +546,7 @@
           <w:color w:val="101317"/>
           <w:sz w:val="22"/>
         </w:rPr>
-        <w:t>I still need measured decisions for globals, constants, strings, homogeneous arrays, hash maps, ownership, and private optimized dispatch. A faster path earns its place only through repeatable NanoLang and Forth measurements.</w:t>
+        <w:t>NSI v0 is a fail-closed document of ids, payloads, and compatibility. Generators emit NanoLang, Forth, Python, Rust, and C++ stubs. Unforgeable NlCap tokens, capability-scoped shared memory, and a POSIX supervisor host services on an ordinary kernel. I do not claim a kernel, or a CUDA or CPython wrap. Authority: docs/NSI.md, docs/NSI_FABRIC.md, docs/NSI_TCB.md.</w:t>
       </w:r>
     </w:p>
     <w:p>
@@ -504,7 +554,7 @@
         <w:pStyle w:val="Heading2"/>
       </w:pPr>
       <w:r>
-        <w:t>FFI and transport</w:t>
+        <w:t>Isolated Nano Emacs walker</w:t>
       </w:r>
     </w:p>
     <w:p>
@@ -517,7 +567,28 @@
           <w:color w:val="101317"/>
           <w:sz w:val="22"/>
         </w:rPr>
-        <w:t>I still need typed call descriptors, a sound mixed-type ABI, consistent argument limits, large-payload transport, and lifecycle evidence for crashes, restarts, and batching.</w:t>
+        <w:t>The SDL frame does not dlopen the interpreter. Eval goes to bin/nano_emacs_worker over a length-prefixed pipe. Crash-restart keeps buffers. freeze-defun runs nano_vm as a grandchild. I do not claim GNU Emacs. Authority: docs/NANO_EMACS.md.</w:t>
+      </w:r>
+    </w:p>
+    <w:p>
+      <w:pPr>
+        <w:pStyle w:val="Heading1"/>
+      </w:pPr>
+      <w:r>
+        <w:t>What I have not done</w:t>
+      </w:r>
+    </w:p>
+    <w:p>
+      <w:pPr>
+        <w:spacing w:after="160" w:line="240" w:lineRule="auto"/>
+      </w:pPr>
+      <w:r>
+        <w:rPr>
+          <w:rFonts w:ascii="Calibri" w:hAnsi="Calibri"/>
+          <w:color w:val="101317"/>
+          <w:sz w:val="22"/>
+        </w:rPr>
+        <w:t>I have not claimed a Forth Standard System, reviewed human translations, GNU Emacs compatibility, a kernel, CUDA or CPython as wrapped runtimes, Makefile header dependencies (GitHub issue #211), or the 5.0 one-IR rewrite. 4.5 effects and replay are next. See docs/RELEASE_4.4.md and docs/ROADMAP.md.</w:t>
       </w:r>
     </w:p>
     <w:p>
@@ -546,7 +617,7 @@
           <w:color w:val="101317"/>
           <w:sz w:val="22"/>
         </w:rPr>
-        <w:t>Start with docs/PERSONA.md, docs/ROADMAP.md, the relevant source symbols, and the matching tests. Keep 4.0 work in its declared queue. Do not turn a roadmap sentence into a feature claim.</w:t>
+        <w:t>Start with docs/PERSONA.md, docs/ROADMAP.md, docs/RELEASE_4.4.md, the relevant source symbols, and the matching tests. Do not turn a roadmap sentence into a feature claim.</w:t>
       </w:r>
     </w:p>
     <w:p>
@@ -567,15 +638,13 @@
           <w:color w:val="65707C"/>
           <w:sz w:val="18"/>
         </w:rPr>
-        <w:t>make -f Makefile.gnu test-nanoisa</w:t>
+        <w:t>make test</w:t>
         <w:br/>
-        <w:t>make -f Makefile.gnu test-nanovm</w:t>
+        <w:t>make test-nsi test-nsi-cap test-nsi-fabric</w:t>
         <w:br/>
-        <w:t>make -f Makefile.gnu test-nanovirt</w:t>
+        <w:t>make test-nano-emacs-worker</w:t>
         <w:br/>
-        <w:t>make -f Makefile.gnu test-dynamic-profile</w:t>
-        <w:br/>
-        <w:t>NANOISA_BENCH_RUNS=20 bash scripts/benchmark_nanoisa.sh</w:t>
+        <w:t>make release-docs-check</w:t>
       </w:r>
     </w:p>
     <w:p>

</xml_diff>

<commit_message>
docs: frame 4.1-4.5 as a language and secure runtime
The last public GitHub Release is v4.0.0. Public notes, LinkedIn draft,
developer deck, and user guide now describe v4.5.0 covering 4.1-4.5,
including NSI, capabilities, POSIX fabric, and the trap journal.

Related to task_d2f80f3c3ca6ee5f81070545a5a2ac5f.
</commit_message>
<xml_diff>
--- a/docs/presentation/nanolang-developer-overview.docx
+++ b/docs/presentation/nanolang-developer-overview.docx
@@ -28,7 +28,7 @@
           <w:color w:val="101317"/>
           <w:sz w:val="22"/>
         </w:rPr>
-        <w:t>I am NanoLang. This is my developer narrative for release 4.4. It explains my language contract, compiler paths, NanoISA bytecode, NanoVM execution, foreign-function boundary, Nano Service Interface, tests, diagnostics, and the work I have not done.</w:t>
+        <w:t>I am NanoLang. This is my developer narrative for release 4.5. It explains my language contract, compiler paths, NanoISA bytecode, NanoVM execution, foreign-function boundary, Nano Service Interface, POSIX capability fabric, trap journal, tests, diagnostics, and the work I have not done. I am a language and a secure runtime. I do not claim a kernel.</w:t>
       </w:r>
     </w:p>
     <w:p>
@@ -41,7 +41,7 @@
           <w:color w:val="101317"/>
           <w:sz w:val="22"/>
         </w:rPr>
-        <w:t>Authority: docs/PERSONA.md, README.md, docs/NANOISA.md, docs/NSI.md, docs/NSI_FABRIC.md, docs/NANO_EMACS.md, docs/ROADMAP.md, spec/nanoisa.yaml, docs/RELEASE_4.4.md, and the current test suites.</w:t>
+        <w:t>Authority: docs/PERSONA.md, README.md, docs/NANOISA.md, docs/NSI.md, docs/NSI_FABRIC.md, docs/NSI_EFFECTS.md, docs/NANO_EMACS.md, docs/ROADMAP.md, spec/nanoisa.yaml, docs/RELEASE_4.5.md, and the current test suites.</w:t>
       </w:r>
     </w:p>
     <w:p>
@@ -362,7 +362,7 @@
           <w:color w:val="101317"/>
           <w:sz w:val="22"/>
         </w:rPr>
-        <w:t>4.0 counted 2,632 NanoISA tests, 621 NanoVM tests, 63 NanoVirt tests, and 93 verifier tests at the v4.0.0 tag. 4.4 adds NSI, fabric, catalog, Forth, and nano_emacs_worker suites on top of that. CI exercises x64, arm64, sanitizers, coverage, documentation, benchmarks, and security checks.</w:t>
+        <w:t>4.0 counted 2,632 NanoISA tests, 621 NanoVM tests, 63 NanoVirt tests, and 93 verifier tests at the v4.0.0 tag. 4.1–4.5 add NSI, fabric, catalog, Forth, nano_emacs_worker, policy, journal, and observability suites on top of that. CI exercises x64, arm64, sanitizers, coverage, documentation, benchmarks, and security checks.</w:t>
       </w:r>
     </w:p>
     <w:p>
@@ -483,7 +483,7 @@
         <w:pStyle w:val="Heading1"/>
       </w:pPr>
       <w:r>
-        <w:t>Release 4.4</w:t>
+        <w:t>Release 4.1–4.5</w:t>
       </w:r>
     </w:p>
     <w:p>
@@ -504,7 +504,7 @@
           <w:color w:val="101317"/>
           <w:sz w:val="22"/>
         </w:rPr>
-        <w:t>A NanoISA Forth session compiles colon definitions to verified bytecode. Jackson Core and Core Ext suites are vendored; make test-forth-coreext and make test-forth-jackson record what they pass. INCLUDED remains a recorded gap. I do not claim a Standard System. Authority: docs/FORTH_2012.md.</w:t>
+        <w:t>A NanoISA Forth session compiles colon definitions to verified bytecode. Jackson Core and Core Ext suites are vendored; make test-forth-coreext and make test-forth-jackson record what they pass. INCLUDED remains a recorded gap. I do not claim a Standard System. Authority: docs/FORTH_2012.md, docs/FORTH_STANDARD_SYSTEM.md.</w:t>
       </w:r>
     </w:p>
     <w:p>
@@ -572,6 +572,27 @@
     </w:p>
     <w:p>
       <w:pPr>
+        <w:pStyle w:val="Heading2"/>
+      </w:pPr>
+      <w:r>
+        <w:t>Effects, policy, journal, and provenance</w:t>
+      </w:r>
+    </w:p>
+    <w:p>
+      <w:pPr>
+        <w:spacing w:after="160" w:line="240" w:lineRule="auto"/>
+      </w:pPr>
+      <w:r>
+        <w:rPr>
+          <w:rFonts w:ascii="Calibri" w:hAnsi="Calibri"/>
+          <w:color w:val="101317"/>
+          <w:sz w:val="22"/>
+        </w:rPr>
+        <w:t>schema/nsi/effect_map.v0.json maps source effects, NanoISA traps, NSI methods, and capabilities. I emit an inventory, generate a deployment manifest, and reject uncovered grants. A versioned journal records trap-boundary events and replays the recorded result without calling the original service. HMAC-SHA256 authenticates a journal with a deployment key; that is not PKI. Checkpoints are sequence numbers, not heap snapshots. The journal is a tested C library in this tag and is not hooked into every vm.c trap. Authority: docs/NSI_EFFECTS.md.</w:t>
+      </w:r>
+    </w:p>
+    <w:p>
+      <w:pPr>
         <w:pStyle w:val="Heading1"/>
       </w:pPr>
       <w:r>
@@ -588,7 +609,7 @@
           <w:color w:val="101317"/>
           <w:sz w:val="22"/>
         </w:rPr>
-        <w:t>I have not claimed a Forth Standard System, reviewed human translations, GNU Emacs compatibility, a kernel, CUDA or CPython as wrapped runtimes, Makefile header dependencies (GitHub issue #211), or the 5.0 one-IR rewrite. 4.5 effects and replay are next. See docs/RELEASE_4.4.md and docs/ROADMAP.md.</w:t>
+        <w:t>I have not claimed a Forth Standard System, reviewed human translations, GNU Emacs compatibility, a kernel, CUDA or CPython as wrapped runtimes, Makefile header dependencies (GitHub issue #211), or the 5.0 one-IR rewrite. See docs/RELEASE_4.5.md and docs/ROADMAP.md.</w:t>
       </w:r>
     </w:p>
     <w:p>
@@ -617,7 +638,7 @@
           <w:color w:val="101317"/>
           <w:sz w:val="22"/>
         </w:rPr>
-        <w:t>Start with docs/PERSONA.md, docs/ROADMAP.md, docs/RELEASE_4.4.md, the relevant source symbols, and the matching tests. Do not turn a roadmap sentence into a feature claim.</w:t>
+        <w:t>Start with docs/PERSONA.md, docs/ROADMAP.md, docs/RELEASE_4.5.md, userguide/guide/08_secure_runtime.md, the relevant source symbols, and the matching tests. Do not turn a roadmap sentence into a feature claim.</w:t>
       </w:r>
     </w:p>
     <w:p>
@@ -640,7 +661,7 @@
         </w:rPr>
         <w:t>make test</w:t>
         <w:br/>
-        <w:t>make test-nsi test-nsi-cap test-nsi-fabric</w:t>
+        <w:t>make test-nsi test-nsi-cap test-nsi-fabric test-nsi-policy test-nsi-journal test-nsi-obs</w:t>
         <w:br/>
         <w:t>make test-nano-emacs-worker</w:t>
         <w:br/>

</xml_diff>

<commit_message>
feat: 4.1–4.5 public-release bar (docs, runtime, leftover 4.1) (#247)
* feat: close 4.1 leftover, sdl_term, and Phase 19

Publish the honest Forth 2012 label, compile the sdl_term MVP as
unsafe smoke, and land the 4.5 effects-to-policy, trap journal, and
observability library so the public cut can cover 4.1-4.5.

Related to task_6087b948f1c9a7672420b4e1ea72bd35,
task_d35028a1b27f45948ffccb351fc7bd4a,
task_2bd5c3128983683b78134ad9257b7d3b.

* docs: frame 4.1-4.5 as a language and secure runtime

The last public GitHub Release is v4.0.0. Public notes, LinkedIn draft,
developer deck, and user guide now describe v4.5.0 covering 4.1-4.5,
including NSI, capabilities, POSIX fabric, and the trap journal.

Related to task_d2f80f3c3ca6ee5f81070545a5a2ac5f.

* test: sync user-guide translation memory with English

CI requires memory.json hashes to match published English pages.
Update them after the 4.5 Secure Runtime chapter and related edits.
</commit_message>
<xml_diff>
--- a/docs/presentation/nanolang-developer-overview.docx
+++ b/docs/presentation/nanolang-developer-overview.docx
@@ -28,7 +28,7 @@
           <w:color w:val="101317"/>
           <w:sz w:val="22"/>
         </w:rPr>
-        <w:t>I am NanoLang. This is my developer narrative for release 4.4. It explains my language contract, compiler paths, NanoISA bytecode, NanoVM execution, foreign-function boundary, Nano Service Interface, tests, diagnostics, and the work I have not done.</w:t>
+        <w:t>I am NanoLang. This is my developer narrative for release 4.5. It explains my language contract, compiler paths, NanoISA bytecode, NanoVM execution, foreign-function boundary, Nano Service Interface, POSIX capability fabric, trap journal, tests, diagnostics, and the work I have not done. I am a language and a secure runtime. I do not claim a kernel.</w:t>
       </w:r>
     </w:p>
     <w:p>
@@ -41,7 +41,7 @@
           <w:color w:val="101317"/>
           <w:sz w:val="22"/>
         </w:rPr>
-        <w:t>Authority: docs/PERSONA.md, README.md, docs/NANOISA.md, docs/NSI.md, docs/NSI_FABRIC.md, docs/NANO_EMACS.md, docs/ROADMAP.md, spec/nanoisa.yaml, docs/RELEASE_4.4.md, and the current test suites.</w:t>
+        <w:t>Authority: docs/PERSONA.md, README.md, docs/NANOISA.md, docs/NSI.md, docs/NSI_FABRIC.md, docs/NSI_EFFECTS.md, docs/NANO_EMACS.md, docs/ROADMAP.md, spec/nanoisa.yaml, docs/RELEASE_4.5.md, and the current test suites.</w:t>
       </w:r>
     </w:p>
     <w:p>
@@ -362,7 +362,7 @@
           <w:color w:val="101317"/>
           <w:sz w:val="22"/>
         </w:rPr>
-        <w:t>4.0 counted 2,632 NanoISA tests, 621 NanoVM tests, 63 NanoVirt tests, and 93 verifier tests at the v4.0.0 tag. 4.4 adds NSI, fabric, catalog, Forth, and nano_emacs_worker suites on top of that. CI exercises x64, arm64, sanitizers, coverage, documentation, benchmarks, and security checks.</w:t>
+        <w:t>4.0 counted 2,632 NanoISA tests, 621 NanoVM tests, 63 NanoVirt tests, and 93 verifier tests at the v4.0.0 tag. 4.1–4.5 add NSI, fabric, catalog, Forth, nano_emacs_worker, policy, journal, and observability suites on top of that. CI exercises x64, arm64, sanitizers, coverage, documentation, benchmarks, and security checks.</w:t>
       </w:r>
     </w:p>
     <w:p>
@@ -483,7 +483,7 @@
         <w:pStyle w:val="Heading1"/>
       </w:pPr>
       <w:r>
-        <w:t>Release 4.4</w:t>
+        <w:t>Release 4.1–4.5</w:t>
       </w:r>
     </w:p>
     <w:p>
@@ -504,7 +504,7 @@
           <w:color w:val="101317"/>
           <w:sz w:val="22"/>
         </w:rPr>
-        <w:t>A NanoISA Forth session compiles colon definitions to verified bytecode. Jackson Core and Core Ext suites are vendored; make test-forth-coreext and make test-forth-jackson record what they pass. INCLUDED remains a recorded gap. I do not claim a Standard System. Authority: docs/FORTH_2012.md.</w:t>
+        <w:t>A NanoISA Forth session compiles colon definitions to verified bytecode. Jackson Core and Core Ext suites are vendored; make test-forth-coreext and make test-forth-jackson record what they pass. INCLUDED remains a recorded gap. I do not claim a Standard System. Authority: docs/FORTH_2012.md, docs/FORTH_STANDARD_SYSTEM.md.</w:t>
       </w:r>
     </w:p>
     <w:p>
@@ -572,6 +572,27 @@
     </w:p>
     <w:p>
       <w:pPr>
+        <w:pStyle w:val="Heading2"/>
+      </w:pPr>
+      <w:r>
+        <w:t>Effects, policy, journal, and provenance</w:t>
+      </w:r>
+    </w:p>
+    <w:p>
+      <w:pPr>
+        <w:spacing w:after="160" w:line="240" w:lineRule="auto"/>
+      </w:pPr>
+      <w:r>
+        <w:rPr>
+          <w:rFonts w:ascii="Calibri" w:hAnsi="Calibri"/>
+          <w:color w:val="101317"/>
+          <w:sz w:val="22"/>
+        </w:rPr>
+        <w:t>schema/nsi/effect_map.v0.json maps source effects, NanoISA traps, NSI methods, and capabilities. I emit an inventory, generate a deployment manifest, and reject uncovered grants. A versioned journal records trap-boundary events and replays the recorded result without calling the original service. HMAC-SHA256 authenticates a journal with a deployment key; that is not PKI. Checkpoints are sequence numbers, not heap snapshots. The journal is a tested C library in this tag and is not hooked into every vm.c trap. Authority: docs/NSI_EFFECTS.md.</w:t>
+      </w:r>
+    </w:p>
+    <w:p>
+      <w:pPr>
         <w:pStyle w:val="Heading1"/>
       </w:pPr>
       <w:r>
@@ -588,7 +609,7 @@
           <w:color w:val="101317"/>
           <w:sz w:val="22"/>
         </w:rPr>
-        <w:t>I have not claimed a Forth Standard System, reviewed human translations, GNU Emacs compatibility, a kernel, CUDA or CPython as wrapped runtimes, Makefile header dependencies (GitHub issue #211), or the 5.0 one-IR rewrite. 4.5 effects and replay are next. See docs/RELEASE_4.4.md and docs/ROADMAP.md.</w:t>
+        <w:t>I have not claimed a Forth Standard System, reviewed human translations, GNU Emacs compatibility, a kernel, CUDA or CPython as wrapped runtimes, Makefile header dependencies (GitHub issue #211), or the 5.0 one-IR rewrite. See docs/RELEASE_4.5.md and docs/ROADMAP.md.</w:t>
       </w:r>
     </w:p>
     <w:p>
@@ -617,7 +638,7 @@
           <w:color w:val="101317"/>
           <w:sz w:val="22"/>
         </w:rPr>
-        <w:t>Start with docs/PERSONA.md, docs/ROADMAP.md, docs/RELEASE_4.4.md, the relevant source symbols, and the matching tests. Do not turn a roadmap sentence into a feature claim.</w:t>
+        <w:t>Start with docs/PERSONA.md, docs/ROADMAP.md, docs/RELEASE_4.5.md, userguide/guide/08_secure_runtime.md, the relevant source symbols, and the matching tests. Do not turn a roadmap sentence into a feature claim.</w:t>
       </w:r>
     </w:p>
     <w:p>
@@ -640,7 +661,7 @@
         </w:rPr>
         <w:t>make test</w:t>
         <w:br/>
-        <w:t>make test-nsi test-nsi-cap test-nsi-fabric</w:t>
+        <w:t>make test-nsi test-nsi-cap test-nsi-fabric test-nsi-policy test-nsi-journal test-nsi-obs</w:t>
         <w:br/>
         <w:t>make test-nano-emacs-worker</w:t>
         <w:br/>

</xml_diff>